<commit_message>
Fix minors template: remove unsupported alt-guardian relationship tags
</commit_message>
<xml_diff>
--- a/templates/canonical/packet_split/minor_children_poa_and_healthcare.docx
+++ b/templates/canonical/packet_split/minor_children_poa_and_healthcare.docx
@@ -98,7 +98,7 @@
       </w:r>
       <w:proofErr w:type="spellEnd"/>
       <w:r>
-        <w:t>]], Virginia [[Zip]], as the parents and natural guardians of any child of ours who is a minor, do hereby appoint our [[firstalternateguardianrelationshiptospouse1]/[[firstalternateguardianrelationshiptospouse2]] [[FIRSTALTERNATEGUARDIANFULLNAME]] and our [[secondalternateguardianrelationshiptospouse1]/[[secondalternateguardianrelationshiptospouse2]] [[SECONDALTERNATEGUARDIANFULLNAME]], or the survivor of them, as our true and lawful co-attorneys-in-fact to act for us and in our name and behalf to take any and all actions necessary for the safety and care of any minor child of which we or either of us are the parent and natural guardian, if we are both unable for any reason to take such actions ourselves, including the following authority:</w:t>
+        <w:t>]], Virginia [[Zip]], as the parents and natural guardians of any child of ours who is a minor, do hereby appoint our [[FIRSTALTERNATEGUARDIANFULLNAME]] and our [[SECONDALTERNATEGUARDIANFULLNAME]], or the survivor of them, as our true and lawful co-attorneys-in-fact to act for us and in our name and behalf to take any and all actions necessary for the safety and care of any minor child of which we or either of us are the parent and natural guardian, if we are both unable for any reason to take such actions ourselves, including the following authority:</w:t>
       </w:r>
     </w:p>
     <w:p>
@@ -590,7 +590,7 @@
       </w:r>
       <w:proofErr w:type="spellEnd"/>
       <w:r>
-        <w:t>]], Virginia [[Zip]], as the parents and natural guardians of any child of ours who is a minor, do hereby designate our [[firstalternateguardianrelationshiptospouse1]/[[firstalternateguardianrelationshiptospouse2]] [[FIRSTALTERNATEGUARDIANFULLNAME]] and our [[secondalternateguardianrelationshiptospouse1]/[[secondalternateguardianrelationshiptospouse2]] [[SECONDALTERNATEGUARDIANFULLNAME]], or the survivor of them, to serve as the joint health care Agents for each such minor child and to make all health care decisions for such minor child if we are (or the survivor of us is) unable or not reasonably available to do so.</w:t>
+        <w:t>]], Virginia [[Zip]], as the parents and natural guardians of any child of ours who is a minor, do hereby designate our [[FIRSTALTERNATEGUARDIANFULLNAME]] and our [[SECONDALTERNATEGUARDIANFULLNAME]], or the survivor of them, to serve as the joint health care Agents for each such minor child and to make all health care decisions for such minor child if we are (or the survivor of us is) unable or not reasonably available to do so.</w:t>
       </w:r>
     </w:p>
     <w:p>

</xml_diff>

<commit_message>
Update memory notes; tweak templates
</commit_message>
<xml_diff>
--- a/templates/canonical/packet_split/minor_children_poa_and_healthcare.docx
+++ b/templates/canonical/packet_split/minor_children_poa_and_healthcare.docx
@@ -98,7 +98,7 @@
       </w:r>
       <w:proofErr w:type="spellEnd"/>
       <w:r>
-        <w:t>]], Virginia [[Zip]], as the parents and natural guardians of any child of ours who is a minor, do hereby appoint our [[FIRSTALTERNATEGUARDIANFULLNAME]] and our [[SECONDALTERNATEGUARDIANFULLNAME]], or the survivor of them, as our true and lawful co-attorneys-in-fact to act for us and in our name and behalf to take any and all actions necessary for the safety and care of any minor child of which we or either of us are the parent and natural guardian, if we are both unable for any reason to take such actions ourselves, including the following authority:</w:t>
+        <w:t>]], Virginia [[Zip]], as the parents and natural guardians of any child of ours who is a minor, do hereby appoint [[FIRSTALTERNATEGUARDIANRELATIONSHIPPHRASEJOINT]] [[FIRSTALTERNATEGUARDIANFULLNAME]] and [[SECONDALTERNATEGUARDIANRELATIONSHIPPHRASEJOINT]] [[SECONDALTERNATEGUARDIANFULLNAME]], or the survivor of them, as our true and lawful co-attorneys-in-fact to act for us and in our name and behalf to take any and all actions necessary for the safety and care of any minor child of which we or either of us are the parent and natural guardian, if we are both unable for any reason to take such actions ourselves, including the following authority:</w:t>
       </w:r>
     </w:p>
     <w:p>
@@ -590,7 +590,7 @@
       </w:r>
       <w:proofErr w:type="spellEnd"/>
       <w:r>
-        <w:t>]], Virginia [[Zip]], as the parents and natural guardians of any child of ours who is a minor, do hereby designate our [[FIRSTALTERNATEGUARDIANFULLNAME]] and our [[SECONDALTERNATEGUARDIANFULLNAME]], or the survivor of them, to serve as the joint health care Agents for each such minor child and to make all health care decisions for such minor child if we are (or the survivor of us is) unable or not reasonably available to do so.</w:t>
+        <w:t>]], Virginia [[Zip]], as the parents and natural guardians of any child of ours who is a minor, do hereby designate [[FIRSTALTERNATEGUARDIANRELATIONSHIPPHRASEJOINT]] [[FIRSTALTERNATEGUARDIANFULLNAME]] and [[SECONDALTERNATEGUARDIANRELATIONSHIPPHRASEJOINT]] [[SECONDALTERNATEGUARDIANFULLNAME]], or the survivor of them, to serve as the joint health care Agents for each such minor child and to make all health care decisions for such minor child if we are (or the survivor of us is) unable or not reasonably available to do so.</w:t>
       </w:r>
     </w:p>
     <w:p>

</xml_diff>